<commit_message>
Merge Opus Hogan-register pass into the live paste pack
Replace Abstract, Introduction, Discussion, Conclusion, and limitations
with the drop-in sections. Methods, Results, tables, figures, and Hogan
weather are unchanged. No new coefficients or citations.

Co-authored-by: Shen Ruililin <bobshenruililin@users.noreply.github.com>
</commit_message>
<xml_diff>
--- a/manuscript/live_collaborative/Heat_CVD_Manuscript_20260813_collab_draft.docx
+++ b/manuscript/live_collaborative/Heat_CVD_Manuscript_20260813_collab_draft.docx
@@ -114,7 +114,7 @@
         <w:t xml:space="preserve"> </w:t>
       </w:r>
       <w:r>
-        <w:t xml:space="preserve">Hong Kong now records more hot nights and very hot days than a decade ago, while cold days continue. Local daily studies of cardiac admissions emphasised cold. Whether that pattern describes contemporary monthly first-hospitalisation counts among people with diabetes or hypertension is a different question.</w:t>
+        <w:t xml:space="preserve">Hong Kong records more hot nights and very hot days than it did a decade ago, and cold days have not disappeared. Earlier local studies of daily cardiac admissions emphasised cold. Whether that pattern also describes recent monthly counts of first hospitalisation among people with diabetes or hypertension is a separate question.</w:t>
       </w:r>
     </w:p>
     <w:p>
@@ -132,7 +132,7 @@
         <w:t xml:space="preserve"> </w:t>
       </w:r>
       <w:r>
-        <w:t xml:space="preserve">We analysed 132 territory-months (January 2013–December 2023) of governed counts of the first recorded hospitalisation after a first coronary heart disease (CHD) or heart failure (HF) diagnosis among people diagnosed with type 2 diabetes and/or hypertension (156,156 CHD events; 29,681 HF events). Admission cause was not recorded. Exposures were monthly mean temperature, mean daily maximum and minimum temperature, and official extreme-day counts (hot nights, very hot days, cold days). Separate negative-binomial models included calendar-month indicators and a natural cubic spline of time (4 df), with a days-in-month offset. Uncertainty was reported as a Model / HC1 / Newey–West lag-3 / Newey–West lag-6 ladder. Benjamini–Hochberg</w:t>
+        <w:t xml:space="preserve">We analysed 132 territory-months (January 2013–December 2023) of governed monthly aggregate counts of the first recorded hospitalisation after a first diagnosis of coronary heart disease (CHD) or heart failure (HF) among people diagnosed with type 2 diabetes and/or hypertension (156,156 CHD events; 29,681 HF events). Admission cause was not recorded. Exposures were monthly mean temperature, the monthly means of daily maximum and minimum temperature, and official counts of hot nights, very hot days, and cold days. Each exposure entered a separate negative-binomial model with calendar-month indicators, a natural cubic spline of time (4 df), and a days-in-month offset. Intervals were reported as a ladder of model-based, HC1, Newey–West lag-3, and Newey–West lag-6 constructions. Benjamini–Hochberg</w:t>
       </w:r>
       <w:r>
         <w:t xml:space="preserve"> </w:t>
@@ -145,7 +145,7 @@
         <w:t xml:space="preserve">q</w:t>
       </w:r>
       <w:r>
-        <w:t xml:space="preserve">-values covered the twelve core contrasts. The model set was specified after the outcome series were available and is exploratory. A method that attempts to recover daily exposure coefficients from monthly sums was tested in simulation and not applied to the health series.</w:t>
+        <w:t xml:space="preserve">-values covered the twelve core contrasts. The model set was specified after the outcome series were available and is exploratory. A method for recovering daily exposure coefficients from monthly sums was tested in simulation and was not applied to the health series.</w:t>
       </w:r>
     </w:p>
     <w:p>
@@ -163,7 +163,7 @@
         <w:t xml:space="preserve"> </w:t>
       </w:r>
       <w:r>
-        <w:t xml:space="preserve">Continuity Newey–West lag-6 count ratios included CHD hot nights per five days 1.022 (1.002–1.042) and HF cold days per five days 1.073 (1.006–1.144); both had</w:t>
+        <w:t xml:space="preserve">Under Newey–West lag-6 reporting, the count ratio was 1.022 (1.002–1.042) per five hot nights for CHD and 1.073 (1.006–1.144) per five cold days for HF. Both had</w:t>
       </w:r>
       <w:r>
         <w:t xml:space="preserve"> </w:t>
@@ -179,7 +179,7 @@
         <w:t xml:space="preserve"> </w:t>
       </w:r>
       <w:r>
-        <w:t xml:space="preserve">= 0.192. All twelve core</w:t>
+        <w:t xml:space="preserve">= 0.192, and all twelve core</w:t>
       </w:r>
       <w:r>
         <w:t xml:space="preserve"> </w:t>
@@ -192,7 +192,7 @@
         <w:t xml:space="preserve">q</w:t>
       </w:r>
       <w:r>
-        <w:t xml:space="preserve">-values exceeded 0.19. For CHD hot nights, Model and HC1 intervals included 1; Newey–West intervals excluded 1 on the unrounded scale. For HF cold days, all four interval constructions excluded 1. Official cold days fell almost entirely in December–February (141 of 145 days). CHD Pearson residual autocorrelation at lag 1 was 0.508; HF 0.146.</w:t>
+        <w:t xml:space="preserve">-values exceeded 0.19. For CHD hot nights, model-based and HC1 intervals included 1, while both Newey–West intervals excluded 1 on the unrounded scale. For HF cold days, all four interval constructions excluded 1. Official cold days fell almost entirely in December–February (141 of 145 days), so the cold-day contrast is identified from differences between winters. Pearson residual autocorrelation at lag 1 was 0.508 for the CHD hot-night model and 0.146 for the HF cold-day model.</w:t>
       </w:r>
     </w:p>
     <w:p>
@@ -210,7 +210,7 @@
         <w:t xml:space="preserve"> </w:t>
       </w:r>
       <w:r>
-        <w:t xml:space="preserve">The data do not support a multiplicity-protected differential thermal claim. The HF cold-day association is concordant across standard-error methods but unprotected by</w:t>
+        <w:t xml:space="preserve">The data do not support a multiplicity-protected differential thermal claim. The HF cold-day association is concordant across standard-error methods but is not protected by its</w:t>
       </w:r>
       <w:r>
         <w:t xml:space="preserve"> </w:t>
@@ -223,7 +223,7 @@
         <w:t xml:space="preserve">q</w:t>
       </w:r>
       <w:r>
-        <w:t xml:space="preserve">-values. The CHD hot-night association is sensitive to how uncertainty is computed. Estimates are ecological monthly count ratios under a first-event construction without recorded admission cause.</w:t>
+        <w:t xml:space="preserve">-value. The CHD hot-night association depends on how uncertainty is computed. All estimates are ecological monthly count ratios for a first-event outcome without recorded admission cause.</w:t>
       </w:r>
     </w:p>
     <w:p>
@@ -259,7 +259,7 @@
         <w:pStyle w:val="FirstParagraph"/>
       </w:pPr>
       <w:r>
-        <w:t xml:space="preserve">Temperature-related cardiovascular morbidity remains a concern in subtropical cities, where intense humid heat coexists with episodic cold [9,10]. Hong Kong is a dense, ageing city in which hot nights and very hot days have become more frequent while cold days have not disappeared [2,4]. At the Hong Kong Observatory (HKO), hot nights increased from 10 in 2013 to 61 in 2021, and very hot days from 17 to 54 in the same selected-year comparison [2,4]. Cold days continued to occur (14 in 2013, 13 in 2021, and 14 in 2023). Contemporary analysis therefore has to keep heat and cold in view together.</w:t>
+        <w:t xml:space="preserve">Temperature-related cardiovascular morbidity remains a concern in subtropical cities, where intense humid heat coexists with episodic cold [9,10]. Hong Kong is a dense, ageing city whose thermal profile has shifted within a single decade. At the Hong Kong Observatory (HKO), hot nights increased from 10 in 2013 to 61 in 2021, and very hot days from 17 to 54 in the same comparison [2,4]. Cold days persisted across the period (14 in 2013, 13 in 2021, and 14 in 2023) [2,4]. A contemporary local analysis therefore has to hold heat and cold in one design.</w:t>
       </w:r>
     </w:p>
     <w:p>
@@ -267,7 +267,7 @@
         <w:pStyle w:val="BodyText"/>
       </w:pPr>
       <w:r>
-        <w:t xml:space="preserve">Earlier Hong Kong evidence on cardiac admissions was daily, diagnosis-specific, and drawn from earlier decades. Using data from 2000–2009, Goggins et al. reported that a 1 °C decrease below an estimated 24 °C threshold was associated with a 3.7% increase in acute myocardial infarction (AMI) admissions, while no statistically significant heat association was observed in Hong Kong, Taipei, or Kaohsiung [1]. The same study identified same-day nitrogen dioxide as an important predictor. A related analysis of public-hospital stroke admissions during 1999–2006 found an inverse association of haemorrhagic stroke with temperature and a weaker ischaemic-stroke association below about 22 °C [11]. For heart failure, Goggins and Chan analysed daily public-hospital admissions and deaths during 2002–2011 and reported a cumulative relative risk of 2.63 (2.43–2.84) for admissions comparing 11 °C with 25 °C over lags extending to 23 days [21]. Those studies establish the local historical pattern. They do not estimate monthly first-hospitalisation counts under a later data contract, and their coefficients are not transferable to that contract.</w:t>
+        <w:t xml:space="preserve">Local evidence on cardiac admissions is daily, diagnosis-specific, and drawn from earlier decades. Using data from 2000–2009, Goggins et al. reported that a 1 °C decrease below an estimated 24 °C threshold was associated with a 3.7% increase in acute myocardial infarction admissions, and found no statistically significant heat association in Hong Kong, Taipei, or Kaohsiung [1]. Same-day nitrogen dioxide was the strongest pollutant predictor in that study [1]. An analysis of public-hospital stroke admissions during 1999–2006 found an inverse association of haemorrhagic stroke with temperature and a weaker ischaemic-stroke association below about 22 °C [11]. Closest to the present outcomes, Goggins and Chan analysed daily public-hospital heart-failure admissions and deaths during 2002–2011 and reported a cumulative relative risk of 2.63 (2.43–2.84) for admissions comparing 11 °C with 25 °C over lags extending to 23 days [21]. These studies fix the local historical pattern. They estimate daily risk for cause-coded admissions, so their coefficients do not transfer to monthly counts of first hospitalisation.</w:t>
       </w:r>
     </w:p>
     <w:p>
@@ -275,7 +275,7 @@
         <w:pStyle w:val="BodyText"/>
       </w:pPr>
       <w:r>
-        <w:t xml:space="preserve">Nighttime heat has since been studied with more than one metric. Guo et al. analysed daily unplanned emergency hospitalisations in Hong Kong during the hot seasons of 2000–2019 [17]. After adjustment for multi-day mean temperature, the official hot-night indicator (minimum temperature ≥ 28 °C) showed no overall association with non-cancer, non-external hospitalisation over lags 0–4 days [17]. An hourly excess-heat metric for 20:00–07:59, and an intensity-based binary derived from it, were associated with higher hospitalisation, including a 3.1% (1.5–4.8%) increase at extreme excess heat [17]. Official monthly counts of hot nights are therefore a coarser encoding than nighttime intensity. They remain an interpretable public climatological series. They are not a test of Guo et al.’s hourly metric, and Guo et al. did not study first CHD or HF hospitalisation in a diabetes or hypertension cohort.</w:t>
+        <w:t xml:space="preserve">Nighttime heat can be encoded in more than one way. Guo et al. analysed daily unplanned emergency hospitalisations in Hong Kong during the hot seasons of 2000–2019 [17]. After adjustment for multi-day mean temperature, the official hot-night indicator (minimum temperature ≥ 28 °C) showed no overall association with non-cancer, non-external hospitalisation over lags 0–4 days [17]. An hourly excess-heat metric for 20:00–07:59 was associated with higher hospitalisation, including a 3.1% (1.5–4.8%) increase at its extreme value [17]. Official monthly counts of hot nights are therefore a coarser encoding than nighttime intensity. They remain an interpretable public climatological series, and they are not a test of the hourly metric. Guo et al. did not study first CHD or HF hospitalisation in a diabetes or hypertension cohort [17].</w:t>
       </w:r>
     </w:p>
     <w:p>
@@ -307,7 +307,7 @@
         <w:t xml:space="preserve"> </w:t>
       </w:r>
       <w:r>
-        <w:t xml:space="preserve">in 2023, fine particulate matter (PM2.5) from 30.8 to 14.6 µg m</w:t>
+        <w:t xml:space="preserve">in 2023, and fine particulate matter (PM2.5) from 30.8 to 14.6 µg m</w:t>
       </w:r>
       <w:r>
         <w:rPr>
@@ -316,7 +316,7 @@
         <w:t xml:space="preserve">−3</w:t>
       </w:r>
       <w:r>
-        <w:t xml:space="preserve">, and ozone rose from 42.6 to 58.3 µg m</w:t>
+        <w:t xml:space="preserve">, while ozone rose from 42.6 to 58.3 µg m</w:t>
       </w:r>
       <w:r>
         <w:rPr>
@@ -328,7 +328,7 @@
         <w:t xml:space="preserve"> </w:t>
       </w:r>
       <w:r>
-        <w:t xml:space="preserve">[7]. Temperature and pollutants are not interchangeable covariates. Ozone in particular may confound or lie on the pathway of hot, sunny conditions, so pollution adjustment, when used, is staged rather than screened for attenuation.</w:t>
+        <w:t xml:space="preserve">[7]. Temperature and pollutants are not interchangeable covariates. Ozone is coupled with hot, sunny conditions and may confound the thermal association or lie on its pathway, so pollution adjustment is staged rather than screened for attenuation.</w:t>
       </w:r>
     </w:p>
     <w:p>
@@ -336,7 +336,7 @@
         <w:pStyle w:val="BodyText"/>
       </w:pPr>
       <w:r>
-        <w:t xml:space="preserve">Daily mortality studies in Hong Kong answer a further, distinct question. Liu et al. (2020) reported a cold-dominant attributable fraction for cause-specific mortality during 2006–2016 (cold 4.72% versus heat 0.16%), with moderate non-optimum temperatures accounting for more burden than extremes [12]. Liu et al. (2026) estimated model-based excess heat deaths under several local heatwave definitions for 2014–2023 [13]. Attributable fractions and modelled excess deaths are not monthly morbidity count ratios.</w:t>
+        <w:t xml:space="preserve">Daily mortality studies in Hong Kong answer a further, distinct question. Liu et al. (2020) reported a cold-dominant attributable fraction for cause-specific mortality during 2006–2016 (4.72% for cold versus 0.16% for heat), and a larger fraction for moderate non-optimum temperatures than for extremes (4.25% versus 0.63%) [12]. Liu et al. (2026) estimated 1,455 to 3,238 model-based excess heat deaths for 2014–2023, the range reflecting which local heatwave definition was applied [13]. Attributable fractions and modelled excess deaths are mortality burden quantities. They cannot be rescaled into monthly morbidity count ratios.</w:t>
       </w:r>
     </w:p>
     <w:p>
@@ -344,7 +344,7 @@
         <w:pStyle w:val="BodyText"/>
       </w:pPr>
       <w:r>
-        <w:t xml:space="preserve">This study estimates the association between specified monthly thermal-exposure contrasts and monthly counts of first hospitalisation after first CHD diagnosis, and after first HF diagnosis, among people with type 2 diabetes and/or hypertension in Hong Kong from January 2013 through December 2023, keeping heat and cold in parallel and reporting definition and uncertainty discordance rather than a single protected claim.</w:t>
+        <w:t xml:space="preserve">This study estimates the association between specified monthly thermal-exposure contrasts and monthly counts of first hospitalisation after first CHD diagnosis, and after first HF diagnosis, among people with type 2 diabetes and/or hypertension in Hong Kong from January 2013 through December 2023. Heat and cold exposures are carried in parallel, and discordance between definitions and between uncertainty constructions is reported in place of a single protected claim.</w:t>
       </w:r>
     </w:p>
     <w:bookmarkEnd w:id="21"/>
@@ -2546,7 +2546,7 @@
         <w:pStyle w:val="FirstParagraph"/>
       </w:pPr>
       <w:r>
-        <w:t xml:space="preserve">The current data do not support a protected differential thermal claim for CHD versus HF. Under continuity Newey–West lag-6 reporting, CHD first-hospitalisation counts were more closely associated with official hot-night burden than with mean temperature or cold days, and HF counts were more closely associated with cold-day burden than with hot nights. Those patterns sit inside multiplicity adjustment that leaves all twelve</w:t>
+        <w:t xml:space="preserve">The current data do not support a protected differential thermal claim for CHD relative to HF. Under continuity Newey–West lag-6 reporting, CHD first-hospitalisation counts were more closely associated with official hot-night burden than with mean temperature or cold days, and HF counts were more closely associated with cold-day burden than with hot nights. Both patterns sit inside a twelve-contrast family in which every</w:t>
       </w:r>
       <w:r>
         <w:t xml:space="preserve"> </w:t>
@@ -2559,7 +2559,15 @@
         <w:t xml:space="preserve">q</w:t>
       </w:r>
       <w:r>
-        <w:t xml:space="preserve">-values above 0.19. The HF cold-day association is the more coherent residual signal: it is concordant across standard-error methods, survives exclusion of the most influential pandemic month, and is not an artefact of entering correlated heat metrics jointly. It remains</w:t>
+        <w:t xml:space="preserve">-value exceeds 0.19. The panel is therefore reported complete, and no contrast is promoted to a primary result.</w:t>
+      </w:r>
+    </w:p>
+    <w:p>
+      <w:pPr>
+        <w:pStyle w:val="BodyText"/>
+      </w:pPr>
+      <w:r>
+        <w:t xml:space="preserve">The HF cold-day association is the more coherent of the two residual signals. It is concordant across all four standard-error constructions. It survives exclusion of the most influential pandemic month. It is not produced by entering correlated heat metrics jointly. It nevertheless remains unprotected by its</w:t>
       </w:r>
       <w:r>
         <w:t xml:space="preserve"> </w:t>
@@ -2572,7 +2580,7 @@
         <w:t xml:space="preserve">q</w:t>
       </w:r>
       <w:r>
-        <w:t xml:space="preserve">-unprotected. Because official cold days fall almost entirely in December–February, that residual is a between-year winter contrast, not a summer-versus-winter contrast. The CHD hot-night association is smaller and depends on the uncertainty method. CHD residual autocorrelation at lag 1 is about 0.51, so model-based intervals are too narrow for that series.</w:t>
+        <w:t xml:space="preserve">-value. Because official cold days fall almost entirely in December–February, the association is identified from differences between winters rather than from a summer-versus-winter contrast.</w:t>
       </w:r>
     </w:p>
     <w:p>
@@ -2580,7 +2588,7 @@
         <w:pStyle w:val="BodyText"/>
       </w:pPr>
       <w:r>
-        <w:t xml:space="preserve">Directionally, the HF cold-day residual is consistent with earlier daily evidence that lower mean temperature was associated with higher HF admissions in Hong Kong [21]. The comparison is of questions, not of magnitudes: a cumulative daily relative risk comparing 11 °C with 25 °C is not a monthly count ratio per five official cold days, and the present event is first hospitalisation after first HF diagnosis without recorded admission cause. The CHD hot-night residual should likewise be read against Guo et al., not as a replication of it [17]. Guo et al. found no overall association for the official hot-night flag with daily emergency hospitalisation after mean-temperature adjustment, and a positive association for hourly nighttime excess heat [17]. The present analysis uses monthly official counts, a first-event CHD series, and a different decade. A difference between monthly mean temperature and monthly official hot-night counts does not identify an intensity mechanism, and sleep, blood pressure, and personal exposure were not measured.</w:t>
+        <w:t xml:space="preserve">The CHD hot-night association is smaller and depends on the uncertainty method. Model-based and HC1 intervals include 1, whereas the Newey–West intervals exclude 1 on the unrounded scale (lag 3: 1.000253 to 1.043860). Pearson residual autocorrelation at lag 1 is 0.508 in that model, so model-based intervals are too narrow for the CHD series. No interval construction was chosen because it excluded 1.</w:t>
       </w:r>
     </w:p>
     <w:p>
@@ -2588,7 +2596,7 @@
         <w:pStyle w:val="BodyText"/>
       </w:pPr>
       <w:r>
-        <w:t xml:space="preserve">Liu et al. (2020, 2026) remain complementary mortality baselines [12,13]. Their attributable fractions and excess-death totals cannot be rescaled into the present count ratios. The failed daily-recovery calibration is the corresponding methods limit: monthly sums do not automatically yield daily trigger estimates [15,16]. That result is project-specific. It does not show that recovery of daily effects from aggregated outcomes fails in general.</w:t>
+        <w:t xml:space="preserve">The direction of the HF cold-day residual is consistent with earlier daily evidence that lower temperature was associated with higher heart-failure admissions in Hong Kong [21]. The comparison is between questions, not between magnitudes. A cumulative daily relative risk comparing 11 °C with 25 °C is not a monthly count ratio per five official cold days, and the present event is a first hospitalisation after a first HF diagnosis without recorded admission cause. The CHD hot-night residual should likewise be read against Guo et al. rather than as a replication of it [17]. That study reported no overall association for the official hot-night flag after adjustment for mean temperature, and a positive association for hourly nighttime excess heat [17]. The present analysis uses monthly official counts, a first-event CHD series, and a later decade. A difference between monthly mean temperature and monthly official hot-night counts does not identify an intensity mechanism, and sleep, blood pressure, and personal exposure were not measured.</w:t>
       </w:r>
     </w:p>
     <w:p>
@@ -2596,7 +2604,7 @@
         <w:pStyle w:val="BodyText"/>
       </w:pPr>
       <w:r>
-        <w:t xml:space="preserve">Pollution and influenza are scientifically motivated in this setting [1,18]. Archive models in which they enter are not continuity-adjusted thermal estimates. On the 121 months with influenza data, an archive model that entered a flu indicator associated influenza with higher CHD counts (1.673, 1.249–2.243). That coefficient is not an adjusted version of Table 2. Confounding by infection, ozone, or nitrogen dioxide is therefore not resolved. Absent cohort person-time, even a stable count ratio remains a count ratio [14].</w:t>
+        <w:t xml:space="preserve">Liu et al. (2020, 2026) remain complementary mortality baselines [12,13]. Their attributable fractions and excess-death totals cannot be rescaled into the present count ratios. The failed daily-recovery calibration is the corresponding methods limit: monthly sums do not automatically yield daily trigger estimates [15,16]. That refusal is specific to this series, this implementation, and this calibration standard. It is not evidence that recovery of daily effects from aggregated outcomes fails in general.</w:t>
       </w:r>
     </w:p>
     <w:p>
@@ -2604,7 +2612,15 @@
         <w:pStyle w:val="BodyText"/>
       </w:pPr>
       <w:r>
-        <w:t xml:space="preserve">A protected primary claim would have required a predeclared confirmatory contrast, multiplicity control that survives the twelve-contrast family, uncertainty constructions that are not chosen for null exclusion, and residual diagnostics that do not leave substantial CHD serial correlation unaddressed. This release does not meet that bar. We report the complete panel and the refusals.</w:t>
+        <w:t xml:space="preserve">Pollution and influenza are scientifically motivated in this setting [1,18]. Archive models in which they enter are not adjusted versions of the continuity panel. On the 121 months with influenza data, an archive model associated influenza activity with higher CHD counts (1.673, 1.249–2.243), and that coefficient does not adjust Table 2. Confounding by infection, ozone, or nitrogen dioxide is therefore unresolved. Absent cohort person-time, even a stable count ratio remains a count ratio [14].</w:t>
+      </w:r>
+    </w:p>
+    <w:p>
+      <w:pPr>
+        <w:pStyle w:val="BodyText"/>
+      </w:pPr>
+      <w:r>
+        <w:t xml:space="preserve">A protected primary claim would have required a predeclared confirmatory contrast, multiplicity control that survives the twelve-contrast family, uncertainty constructions that are not chosen for null exclusion, and residual diagnostics that leave no substantial CHD serial correlation unaddressed. This analysis does not meet that bar. We report the complete panel and the refusals.</w:t>
       </w:r>
     </w:p>
     <w:bookmarkEnd w:id="47"/>
@@ -2622,7 +2638,7 @@
         <w:pStyle w:val="FirstParagraph"/>
       </w:pPr>
       <w:r>
-        <w:t xml:space="preserve">Between 2013 and 2023, Hong Kong experienced a large increase in hot nights while cold days persisted. In governed monthly data for people with diabetes and/or hypertension, CHD first-hospitalisation counts were most elevated in relation to hot nights, and HF counts in relation to cold days. Neither pattern survived correction across twelve comparisons, and the CHD result was sensitive to the treatment of uncertainty. The study therefore offers hypotheses and an aggregation-aware reporting standard, not proof of thermal effects on disease-caused admission.</w:t>
+        <w:t xml:space="preserve">Between 2013 and 2023, hot nights in Hong Kong increased while cold days persisted. In governed monthly aggregates for people with type 2 diabetes and/or hypertension, the largest positive thermal association was with hot nights for CHD first hospitalisations and with cold days for HF first hospitalisations. Neither association survived correction across the twelve comparisons, and the CHD estimate depended on the treatment of uncertainty. The contribution of this analysis is a set of hypotheses and an explicit account of what monthly aggregate counts cannot settle. Better-denominated and more finely resolved data are required before a thermal effect on cardiac hospitalisation in this cohort can be estimated.</w:t>
       </w:r>
     </w:p>
     <w:bookmarkEnd w:id="48"/>
@@ -2640,7 +2656,17 @@
         <w:pStyle w:val="FirstParagraph"/>
       </w:pPr>
       <w:r>
-        <w:t xml:space="preserve">Strengths include a complete twelve-contrast panel, an explicit standard-error ladder, source-documented official extreme-day thresholds, identification displays for cold-day support and first-event depletion, and a refused daily-recovery analysis.</w:t>
+        <w:rPr>
+          <w:bCs/>
+          <w:b/>
+        </w:rPr>
+        <w:t xml:space="preserve">Strengths.</w:t>
+      </w:r>
+      <w:r>
+        <w:t xml:space="preserve"> </w:t>
+      </w:r>
+      <w:r>
+        <w:t xml:space="preserve">The twelve-contrast panel is reported in full rather than filtered to its largest estimates. Uncertainty is shown as an explicit four-construction ladder rather than as a single interval. Extreme-day exposures use published official thresholds. Identification displays show where cold-day variation and first-event decline come from. The daily-recovery analysis is reported as a refusal rather than as a coefficient.</w:t>
       </w:r>
     </w:p>
     <w:p>
@@ -2648,7 +2674,17 @@
         <w:pStyle w:val="BodyText"/>
       </w:pPr>
       <w:r>
-        <w:t xml:space="preserve">Limitations. Admission cause was not recorded. Inpatient-only semantics remain unconfirmed. Cohort person-time still at risk of a first event was unavailable. The analysis is ecological and monthly [14]. Age, sex, and subtype strata were not delivered. CHD residual serial correlation remains material. Official cold-day counts are winter-concentrated, so the HF cold-day residual is identified from between-year winter differences. Official hot-night counts are not hourly nighttime excess heat [17]. Weather hot-month and cold-month reference rules remain unlocked. Pollution, humidity, and influenza confounding is unresolved in the continuity panel. External dissemination of the governed aggregates still requires confirmation from the outcome and supervising investigators.</w:t>
+        <w:rPr>
+          <w:bCs/>
+          <w:b/>
+        </w:rPr>
+        <w:t xml:space="preserve">Limitations.</w:t>
+      </w:r>
+      <w:r>
+        <w:t xml:space="preserve"> </w:t>
+      </w:r>
+      <w:r>
+        <w:t xml:space="preserve">Admission cause was not recorded, so an event is a first hospitalisation after a first diagnosis and not a cardiac-caused admission. Inpatient-only semantics are inferred from the delivered column labels and remain to be confirmed. Monthly counts of cohort members still at risk of a first event were unavailable, so the estimates are count ratios rather than incidence-rate ratios [14]. The design is ecological and monthly, so individual-level and daily-triggering interpretations are not identified [14]. Age, sex, and disease-subtype strata were not delivered. Residual serial correlation remains material for CHD, with lag-1 Pearson autocorrelation of 0.508 in the leading model. Official cold days are concentrated in December–February, so the HF cold-day estimate rests on differences between winters. Official hot-night counts are not hourly nighttime excess heat [17]. Reference rules for monthly hot-tail and cold-tail indicators are not yet fixed, and no such indicator was used as a confirmatory exposure. Pollution, humidity, and influenza confounding is unresolved in the continuity panel. A stroke series was named in correspondence but was not delivered, and no stroke result is reported. External dissemination of the governed aggregates requires confirmation from the outcome and supervising investigators.</w:t>
       </w:r>
     </w:p>
     <w:bookmarkEnd w:id="49"/>

</xml_diff>

<commit_message>
Add Fable senior-scientist critique of live manuscript
Co-authored-by: Shen Ruililin <bobshenruililin@users.noreply.github.com>
</commit_message>
<xml_diff>
--- a/manuscript/live_collaborative/Heat_CVD_Manuscript_20260813_collab_draft.docx
+++ b/manuscript/live_collaborative/Heat_CVD_Manuscript_20260813_collab_draft.docx
@@ -1157,7 +1157,7 @@
         <w:pStyle w:val="FirstParagraph"/>
       </w:pPr>
       <w:r>
-        <w:t xml:space="preserve">At HKO Headquarters, hot nights rose from 10 in 2013 to 61 in 2021 and 56 in 2023. The 2021 total was the highest annual number of hot nights in the Observatory record through the study window. Very hot days rose from 17 to 54 over the same 2013–2021 comparison and were 54 in 2023. Cold days were 14 in 2013 and 14 in 2023 (1 in 2019; 13 in 2021). These are exposure counts, not health effects. Figure 2 shows official cold days by year and month. Of 145 cold days in 2013–2023, 141 fell in December–February (December 40, January 54, February 47) and 4 fell in March. The year 2019 contributed a single cold day. After calendar-month indicators, remaining cold-day variation is between-year winter, not a summer-versus-winter contrast.</w:t>
+        <w:t xml:space="preserve">At HKO Headquarters, hot nights rose from 10 in 2013 to 61 in 2021 and 56 in 2023. The 2013 count was about seven days below the 1981–2010 normal [2]. The 2021 total was the highest annual number of hot nights in the Observatory record through the study window. Very hot days rose from 17 to 54 over the same 2013–2021 comparison and were 54 in 2023. Cold days were 14 in 2013 and 14 in 2023 (1 in 2019; 13 in 2021). These are exposure counts, not health effects. Figure 2 shows official cold days by year and month. Of 145 cold days in 2013–2023, 141 fell in December–February (December 40, January 54, February 47) and 4 fell in March. The year 2019 contributed a single cold day. After calendar-month indicators, remaining cold-day variation is between-year winter, not a summer-versus-winter contrast.</w:t>
       </w:r>
     </w:p>
     <w:p>
@@ -2559,7 +2559,7 @@
         <w:t xml:space="preserve">q</w:t>
       </w:r>
       <w:r>
-        <w:t xml:space="preserve">-value exceeds 0.19. The panel is therefore reported complete, and no contrast is promoted to a primary result.</w:t>
+        <w:t xml:space="preserve">-value exceeds 0.19. The complete panel is therefore reported, and no contrast is promoted to a primary result.</w:t>
       </w:r>
     </w:p>
     <w:p>
@@ -2666,7 +2666,7 @@
         <w:t xml:space="preserve"> </w:t>
       </w:r>
       <w:r>
-        <w:t xml:space="preserve">The twelve-contrast panel is reported in full rather than filtered to its largest estimates. Uncertainty is shown as an explicit four-construction ladder rather than as a single interval. Extreme-day exposures use published official thresholds. Identification displays show where cold-day variation and first-event decline come from. The daily-recovery analysis is reported as a refusal rather than as a coefficient.</w:t>
+        <w:t xml:space="preserve">The twelve-contrast panel is reported in full rather than filtered to its largest estimates. Uncertainty is shown as an explicit four-construction ladder rather than as a single interval. Extreme-day exposures use published official thresholds. Identification displays show the sources of cold-day variation and of the first-event decline. The daily-recovery analysis is reported as a refusal rather than as a coefficient.</w:t>
       </w:r>
     </w:p>
     <w:p>

</xml_diff>

<commit_message>
Merge Fable honesty pass into the live paste pack
Correct the Newey-West rationale (CHD hot-night robust intervals are narrower than Model), report the pre-2020 and COVID-phase CHD hot-night intervals beside the HF pre-2020 result, replace undefined "continuity" with a defined core panel, and keep Stage 3 PDFs frozen.

Co-authored-by: Shen Ruililin <bobshenruililin@users.noreply.github.com>
</commit_message>
<xml_diff>
--- a/manuscript/live_collaborative/Heat_CVD_Manuscript_20260813_collab_draft.docx
+++ b/manuscript/live_collaborative/Heat_CVD_Manuscript_20260813_collab_draft.docx
@@ -259,7 +259,7 @@
         <w:pStyle w:val="FirstParagraph"/>
       </w:pPr>
       <w:r>
-        <w:t xml:space="preserve">Temperature-related cardiovascular morbidity remains a concern in subtropical cities, where intense humid heat coexists with episodic cold [9,10]. Hong Kong is a dense, ageing city whose thermal profile has shifted within a single decade. At the Hong Kong Observatory (HKO), hot nights increased from 10 in 2013 to 61 in 2021, and very hot days from 17 to 54 in the same comparison [2,4]. Cold days persisted across the period (14 in 2013, 13 in 2021, and 14 in 2023) [2,4]. A contemporary local analysis therefore has to hold heat and cold in one design.</w:t>
+        <w:t xml:space="preserve">Temperature-related cardiovascular morbidity remains a concern in subtropical cities, where intense humid heat coexists with episodic cold [9]. Hong Kong is a dense, ageing city whose thermal profile has shifted within a single decade. At the Hong Kong Observatory (HKO), hot nights increased from 10 in 2013 to 61 in 2021, and very hot days from 17 to 54 in the same comparison [2,4]. Cold days persisted across the period (14 in 2013, 13 in 2021, and 14 in 2023) [2,4,6]. A contemporary local analysis therefore has to hold heat and cold in one design.</w:t>
       </w:r>
     </w:p>
     <w:p>
@@ -275,7 +275,7 @@
         <w:pStyle w:val="BodyText"/>
       </w:pPr>
       <w:r>
-        <w:t xml:space="preserve">Nighttime heat can be encoded in more than one way. Guo et al. analysed daily unplanned emergency hospitalisations in Hong Kong during the hot seasons of 2000–2019 [17]. After adjustment for multi-day mean temperature, the official hot-night indicator (minimum temperature ≥ 28 °C) showed no overall association with non-cancer, non-external hospitalisation over lags 0–4 days [17]. An hourly excess-heat metric for 20:00–07:59 was associated with higher hospitalisation, including a 3.1% (1.5–4.8%) increase at its extreme value [17]. Official monthly counts of hot nights are therefore a coarser encoding than nighttime intensity. They remain an interpretable public climatological series, and they are not a test of the hourly metric. Guo et al. did not study first CHD or HF hospitalisation in a diabetes or hypertension cohort [17].</w:t>
+        <w:t xml:space="preserve">Nighttime heat can be encoded in more than one way. Guo et al. analysed daily unplanned emergency hospitalisations in Hong Kong during the hot seasons of 2000–2019 [17]. After adjustment for multi-day mean temperature, the official hot-night indicator (minimum temperature ≥ 28 °C) showed no overall association with non-cancer, non-external hospitalisation over lags 0–4 days (excess relative risk −0.2%, 95% CI −1.2% to 0.7%) [17]. An hourly excess-heat metric for 20:00–07:59 was associated with higher hospitalisation, including a 3.1% (1.5–4.8%) increase at its extreme value [17]. Official monthly counts of hot nights are, by construction, a coarser encoding than nighttime intensity. They remain an interpretable public climatological series, and they are not a test of the hourly metric. Guo et al. did not study first CHD or HF hospitalisation in a diabetes or hypertension cohort [17].</w:t>
       </w:r>
     </w:p>
     <w:p>
@@ -328,7 +328,7 @@
         <w:t xml:space="preserve"> </w:t>
       </w:r>
       <w:r>
-        <w:t xml:space="preserve">[7]. Temperature and pollutants are not interchangeable covariates. Ozone is coupled with hot, sunny conditions and may confound the thermal association or lie on its pathway, so pollution adjustment is staged rather than screened for attenuation.</w:t>
+        <w:t xml:space="preserve">[7]. Temperature and pollutants are not interchangeable covariates. Ozone is coupled with hot, sunny conditions and may confound the thermal association or lie on its pathway.</w:t>
       </w:r>
     </w:p>
     <w:p>
@@ -371,7 +371,7 @@
         <w:pStyle w:val="FirstParagraph"/>
       </w:pPr>
       <w:r>
-        <w:t xml:space="preserve">The design is an ecological territory-month time series covering January 2013 through December 2023 (132 months). For each separate single-exposure model, the target quantity is a count ratio associated with a 1 °C or five-day exposure contrast, conditional on calendar month and a smooth function of time. Individual causal effects, principal-diagnosis CHD or HF, AMI, and daily triggering are not identified [14]. Because the diabetes or hypertension cohort still at risk of a first event was unavailable, the analysis-of-record offset is days in month. Estimates are therefore monthly count ratios, not cohort incidence-rate ratios [14]. The twelve-contrast model set was specified after the outcome series were available and is exploratory.</w:t>
+        <w:t xml:space="preserve">The design is an ecological territory-month time series covering January 2013 through December 2023 (132 months). For each separate single-exposure model, the target quantity is a count ratio associated with a 1 °C or five-day exposure contrast, conditional on calendar month and a smooth function of time. Individual causal effects, principal-diagnosis CHD or HF, AMI, and daily triggering are not identified [14]. Because the diabetes or hypertension cohort still at risk of a first event was unavailable, the analysis-of-record offset is days in month. Estimates are therefore monthly count ratios, not cohort incidence-rate ratios [14]. The twelve-contrast model set was specified after the outcome series were available and is exploratory. We refer to the twelve separate single-exposure models as the core panel.</w:t>
       </w:r>
     </w:p>
     <w:bookmarkEnd w:id="22"/>
@@ -520,7 +520,7 @@
         <w:pStyle w:val="BodyText"/>
       </w:pPr>
       <w:r>
-        <w:t xml:space="preserve">Daily Headquarters series were aggregated to calendar months for analysis. Continuity exposures were monthly mean temperature, the monthly means of daily maximum and minimum temperature, and official counts of hot nights, very hot days, and cold days, the last three scaled per five days so that coefficients correspond to a five-day contrast rather than a single extreme day. Official cold days were concentrated in December–February (141 of 145 days across 2013–2023; four days fell in March). With calendar-month indicators in the model, remaining cold-day variation is between-year differences within winter months. A winter-only restriction is a labelled sensitivity, not a remedy for that identification. Extremely hot days, relative humidity, rainfall, and sulfur dioxide were assembled with the weather series but were not entered in the twelve-contrast continuity panel. Fine particulate matter (PM2.5) from general EPD stations was assembled for staged pollution sensitivities. A station-month contributed to a pollutant mean only when at least 75% of expected observations were available; missing measurements were not coded as zero. Territory-wide monthly concentrations were unweighted means across eligible general stations. Roadside stations were reserved. Nitrogen dioxide and particulate matter were specified to enter before ozone, because ozone is coupled with hot, sunny conditions. Staged pollution models exist in the archive; they are not adjusted versions of the separate continuity panel and were not used to claim that confounding is resolved. Operational heatwave-spell and hot-month rules beyond the official daily thresholds remain with the weather co-investigator; provisional monthly-tail indicators were not used as confirmatory exposures.</w:t>
+        <w:t xml:space="preserve">Daily Headquarters series were aggregated to calendar months for analysis. Core exposures were monthly mean temperature, the monthly means of daily maximum and minimum temperature, and official counts of hot nights, very hot days, and cold days, the last three scaled per five days so that coefficients correspond to a five-day contrast rather than a single extreme day. Official cold days were concentrated in December–February (141 of 145 days across 2013–2023; four days fell in March). With calendar-month indicators in the model, remaining cold-day variation is between-year differences within winter months. A winter-only restriction is a labelled sensitivity, not a remedy for that identification. Extremely hot days, relative humidity, rainfall, and sulfur dioxide were assembled with the weather series but were not entered in the twelve-contrast core panel. Fine particulate matter (PM2.5) from general EPD stations was assembled for staged pollution sensitivities. A station-month contributed to a pollutant mean only when at least 75% of expected observations were available; missing measurements were not coded as zero. Territory-wide monthly concentrations were unweighted means across eligible general stations. Roadside stations were reserved. Nitrogen dioxide and particulate matter were specified to enter before ozone, because ozone is coupled with hot, sunny conditions. Staged pollution models exist in the archive; they are not adjusted versions of the separate core panel and were not used to claim that confounding is resolved. Operational heatwave-spell and hot-month rules beyond the official daily thresholds remain with the weather co-investigator; provisional monthly-tail indicators were not used as confirmatory exposures.</w:t>
       </w:r>
     </w:p>
     <w:bookmarkEnd w:id="24"/>
@@ -538,7 +538,7 @@
         <w:pStyle w:val="FirstParagraph"/>
       </w:pPr>
       <w:r>
-        <w:t xml:space="preserve">Monthly influenza activity was obtained from Centre for Health Protection Flu Express summaries. Coverage was 121 of 132 months, with the gap in early 2013. Missing influenza months were left missing and were never coded as zero. Influenza was not entered in the twelve-contrast continuity panel.</w:t>
+        <w:t xml:space="preserve">Monthly influenza activity was obtained from Centre for Health Protection Flu Express summaries. Coverage was 121 of 132 months, with the gap in early 2013. Missing influenza months were left missing and were never coded as zero. Influenza was not entered in the twelve-contrast core panel.</w:t>
       </w:r>
     </w:p>
     <w:bookmarkEnd w:id="25"/>
@@ -556,7 +556,7 @@
         <w:pStyle w:val="FirstParagraph"/>
       </w:pPr>
       <w:r>
-        <w:t xml:space="preserve">Age- and sex-specific mid-year population estimates from the Census and Statistics Department (Table 110-01001) were linearly interpolated to calendar-month midpoints [8]. Those denominators describe the general population, not the diabetes or hypertension cohort still at risk of a first CHD or HF hospitalisation. Continuity models therefore used a days-in-month offset, (</w:t>
+        <w:t xml:space="preserve">Age- and sex-specific mid-year population estimates from the Census and Statistics Department (Table 110-01001) were linearly interpolated to calendar-month midpoints [8]. Those denominators describe the general population, not the diabetes or hypertension cohort still at risk of a first CHD or HF hospitalisation. Core models therefore used a days-in-month offset, (</w:t>
       </w:r>
       <w:r>
         <w:t xml:space="preserve">(d_t)), and are interpreted as monthly count ratios [14]. A general-population × days offset was retained only as a sensitivity. It does not convert the estimand into cohort incidence.</w:t>
@@ -577,7 +577,7 @@
         <w:pStyle w:val="FirstParagraph"/>
       </w:pPr>
       <w:r>
-        <w:t xml:space="preserve">Let (Y_t) be the monthly count in month (t). Continuity models used a negative-binomial likelihood [10],</w:t>
+        <w:t xml:space="preserve">Let (Y_t) be the monthly count in month (t). Core models used a negative-binomial likelihood [10],</w:t>
       </w:r>
     </w:p>
     <w:p>
@@ -644,7 +644,7 @@
         <w:t xml:space="preserve">where (d_t) is days in month, (X_t) is a single exposure, and (s(t; 4~</w:t>
       </w:r>
       <w:r>
-        <w:t xml:space="preserve">)) is a natural cubic spline of month index. Each continuity model entered one exposure at a time: mean temperature, mean maximum temperature, mean minimum temperature, hot nights, cold days, or very hot days, for CHD and for HF (twelve contrasts). Quasi-Poisson models were a family sensitivity. Negative binomial was preferred because monthly counts were overdispersed relative to Poisson.</w:t>
+        <w:t xml:space="preserve">)) is a natural cubic spline of month index. Each core model entered one exposure at a time: mean temperature, mean maximum temperature, mean minimum temperature, hot nights, cold days, or very hot days, for CHD and for HF (twelve contrasts). Quasi-Poisson models were a family sensitivity. Negative binomial was preferred because monthly counts were overdispersed relative to Poisson.</w:t>
       </w:r>
     </w:p>
     <w:p>
@@ -652,7 +652,7 @@
         <w:pStyle w:val="BodyText"/>
       </w:pPr>
       <w:r>
-        <w:t xml:space="preserve">Continuity intervals used Newey–West standard errors with lag 6 [19], reported together with model-based, HC1, and Newey–West lag-3 intervals. Lag 6 was the continuity reporting choice because residual serial dependence is expected in monthly counts and is material for CHD. No interval was selected because it excluded 1.</w:t>
+        <w:t xml:space="preserve">Core intervals used Newey–West standard errors with lag 6 [19], reported together with model-based, HC1, and Newey–West lag-3 intervals. Lag 6 was the core reporting choice because residual serial dependence is expected in monthly counts and is material for CHD. Robust intervals are not automatically wider than model-based intervals; the four-construction ladder is reported for that reason. No interval was selected because it excluded 1.</w:t>
       </w:r>
     </w:p>
     <w:p>
@@ -681,7 +681,7 @@
         <w:t xml:space="preserve">q</w:t>
       </w:r>
       <w:r>
-        <w:t xml:space="preserve">-values were computed across the twelve continuity contrasts [20].</w:t>
+        <w:t xml:space="preserve">-values were computed across the twelve core contrasts [20].</w:t>
       </w:r>
     </w:p>
     <w:p>
@@ -689,7 +689,7 @@
         <w:pStyle w:val="BodyText"/>
       </w:pPr>
       <w:r>
-        <w:t xml:space="preserve">Archive models that entered pollution, humidity, or influenza are not adjusted versions of the separate continuity panel. They were not used to claim that confounding is resolved.</w:t>
+        <w:t xml:space="preserve">Archive models that entered pollution, humidity, or influenza are not adjusted versions of the separate core panel. They were not used to claim that confounding is resolved.</w:t>
       </w:r>
     </w:p>
     <w:bookmarkEnd w:id="27"/>
@@ -1157,7 +1157,7 @@
         <w:pStyle w:val="FirstParagraph"/>
       </w:pPr>
       <w:r>
-        <w:t xml:space="preserve">At HKO Headquarters, hot nights rose from 10 in 2013 to 61 in 2021 and 56 in 2023. The 2013 count was about seven days below the 1981–2010 normal [2]. The 2021 total was the highest annual number of hot nights in the Observatory record through the study window. Very hot days rose from 17 to 54 over the same 2013–2021 comparison and were 54 in 2023. Cold days were 14 in 2013 and 14 in 2023 (1 in 2019; 13 in 2021). These are exposure counts, not health effects. Figure 2 shows official cold days by year and month. Of 145 cold days in 2013–2023, 141 fell in December–February (December 40, January 54, February 47) and 4 fell in March. The year 2019 contributed a single cold day. After calendar-month indicators, remaining cold-day variation is between-year winter, not a summer-versus-winter contrast.</w:t>
+        <w:t xml:space="preserve">At HKO Headquarters, hot nights rose from 10 in 2013 to 61 in 2021 and 56 in 2023 [6]. The 2013 count was about seven days below the 1981–2010 normal [2]. The 2021 total was the highest annual number of hot nights in the Observatory record through the study window. Very hot days rose from 17 to 54 over the same 2013–2021 comparison and were 54 in 2023. Cold days were 14 in 2013 and 14 in 2023 (1 in 2019; 13 in 2021). These are exposure counts, not health effects. Figure 2 shows official cold days by year and month. Of 145 cold days in 2013–2023, 141 fell in December–February (December 40, January 54, February 47) and 4 fell in March. The year 2019 contributed a single cold day. After calendar-month indicators, remaining cold-day variation is between-year winter, not a summer-versus-winter contrast.</w:t>
       </w:r>
     </w:p>
     <w:p>
@@ -1234,13 +1234,13 @@
       </w:r>
     </w:p>
     <w:bookmarkEnd w:id="39"/>
-    <w:bookmarkStart w:id="40" w:name="continuity-panel"/>
+    <w:bookmarkStart w:id="40" w:name="core-panel"/>
     <w:p>
       <w:pPr>
         <w:pStyle w:val="Heading3"/>
       </w:pPr>
       <w:r>
-        <w:t xml:space="preserve">Continuity panel</w:t>
+        <w:t xml:space="preserve">Core panel</w:t>
       </w:r>
     </w:p>
     <w:p>
@@ -2361,7 +2361,7 @@
         <w:pStyle w:val="BodyText"/>
       </w:pPr>
       <w:r>
-        <w:t xml:space="preserve">For CHD hot nights, Model and HC1 intervals included 1; NW3 and NW6 excluded 1 on the unrounded scale (NW3 1.000253–1.043860). For HF cold days, all four constructions excluded 1, but</w:t>
+        <w:t xml:space="preserve">For CHD hot nights, Model and HC1 intervals included 1; NW3 and NW6 excluded 1 on the unrounded scale (NW3 1.000253–1.043860). For that contrast the ladder narrowed from the model-based to the Newey–West intervals; robust intervals are not automatically wider, and the direction of that change is itself informative. For HF cold days, all four constructions excluded 1, but</w:t>
       </w:r>
       <w:r>
         <w:t xml:space="preserve"> </w:t>
@@ -2403,7 +2403,7 @@
         <w:pStyle w:val="BodyText"/>
       </w:pPr>
       <w:r>
-        <w:t xml:space="preserve">Pearson residual autocorrelation at lag 1 was 0.51–0.53 for CHD continuity models and 0.13–0.18 for HF. For the two leading contrasts it was 0.508 (CHD hot nights) and 0.146 (HF cold days) (Figure 3). Ljung–Box tests at lag 6 rejected residual white noise for CHD (</w:t>
+        <w:t xml:space="preserve">Pearson residual autocorrelation at lag 1 was 0.51–0.53 for CHD core models and 0.13–0.18 for HF. For the two leading contrasts it was 0.508 (CHD hot nights) and 0.146 (HF cold days) (Figure 3). Ljung–Box tests at lag 6 rejected residual white noise for CHD (</w:t>
       </w:r>
       <w:r>
         <w:rPr>
@@ -2438,7 +2438,7 @@
         <w:t xml:space="preserve"> </w:t>
       </w:r>
       <w:r>
-        <w:t xml:space="preserve">&gt; 0.3). Serial dependence is part of the inferential problem for CHD. It is why Newey–West intervals are shown rather than model-based intervals alone.</w:t>
+        <w:t xml:space="preserve">&gt; 0.3). Serial dependence is part of the inferential problem for CHD, which is why the four-construction ladder is shown rather than a single interval.</w:t>
       </w:r>
     </w:p>
     <w:p>
@@ -2456,7 +2456,7 @@
         <w:t xml:space="preserve"> </w:t>
       </w:r>
       <w:r>
-        <w:t xml:space="preserve">Lag-1 autocorrelation is 0.508 for the CHD hot-night model and 0.146 for the HF cold-day model. Dashed lines are ±1.96/√132. Provenance: REAL residuals from already-fitted continuity models.</w:t>
+        <w:t xml:space="preserve">Lag-1 autocorrelation is 0.508 for the CHD hot-night model and 0.146 for the HF cold-day model. Dashed lines are ±1.96/√132. Provenance: REAL residuals from already-fitted core models.</w:t>
       </w:r>
     </w:p>
     <w:p>
@@ -2519,7 +2519,7 @@
         <w:pStyle w:val="BodyText"/>
       </w:pPr>
       <w:r>
-        <w:t xml:space="preserve">Offset choice changed continuity count ratios only trivially. Across trend and early-period specifications, the CHD hot-night ratio ranged from 1.011 to 1.025 and the HF cold-day ratio from 1.043 to 1.113. The HF cold-day association was stronger before 2020 (1.113, 1.053–1.176). Lag-1 month models attenuated the CHD hot-night association toward 1 (1.010, 0.979–1.042). The HF cold-day association remained elevated at lag 1 (1.073, 1.014–1.135) and was weaker at lag 2 (1.053, 0.985–1.127). Lag-one month is a labelled sensitivity; it is not a daily lag curve. The months with largest Cook’s distance were February 2020 (CHD) and February 2022 (HF cold days). Excluding the worst month left both exploratory directions unchanged (CHD hot nights 1.021, 1.001–1.040; HF cold days 1.088, 1.034–1.144).</w:t>
+        <w:t xml:space="preserve">Offset choice changed core count ratios only trivially. Across trend and early-period specifications, the CHD hot-night ratio ranged from 1.011 to 1.025 and the HF cold-day ratio from 1.043 to 1.113. The HF cold-day association was stronger before 2020 (1.113, 1.053–1.176). The CHD hot-night association was weaker and compatible with 1 in the pre-2020 window (1.011, 0.991–1.032) and under COVID-phase adjustment (1.013, 0.994–1.033). Lag-1 month models attenuated the CHD hot-night association toward 1 (1.010, 0.979–1.042). The HF cold-day association remained elevated at lag 1 (1.073, 1.014–1.135) and was weaker at lag 2 (1.053, 0.985–1.127). Lag-one month is a labelled sensitivity; it is not a daily lag curve. The months with largest Cook’s distance were February 2020 (CHD) and February 2022 (HF cold days). Excluding the worst month left both exploratory directions unchanged (CHD hot nights 1.021, 1.001–1.040; HF cold days 1.088, 1.034–1.144).</w:t>
       </w:r>
     </w:p>
     <w:p>
@@ -2546,7 +2546,7 @@
         <w:pStyle w:val="FirstParagraph"/>
       </w:pPr>
       <w:r>
-        <w:t xml:space="preserve">The current data do not support a protected differential thermal claim for CHD relative to HF. Under continuity Newey–West lag-6 reporting, CHD first-hospitalisation counts were more closely associated with official hot-night burden than with mean temperature or cold days, and HF counts were more closely associated with cold-day burden than with hot nights. Both patterns sit inside a twelve-contrast family in which every</w:t>
+        <w:t xml:space="preserve">The current data do not support a protected differential thermal claim for CHD relative to HF. Under Newey–West lag-6 reporting for the core panel, CHD first-hospitalisation counts were more closely associated with official hot-night burden than with mean temperature or cold days, and HF counts were more closely associated with cold-day burden than with hot nights. Both patterns sit inside a twelve-contrast family in which every</w:t>
       </w:r>
       <w:r>
         <w:t xml:space="preserve"> </w:t>
@@ -2588,7 +2588,7 @@
         <w:pStyle w:val="BodyText"/>
       </w:pPr>
       <w:r>
-        <w:t xml:space="preserve">The CHD hot-night association is smaller and depends on the uncertainty method. Model-based and HC1 intervals include 1, whereas the Newey–West intervals exclude 1 on the unrounded scale (lag 3: 1.000253 to 1.043860). Pearson residual autocorrelation at lag 1 is 0.508 in that model, so model-based intervals are too narrow for the CHD series. No interval construction was chosen because it excluded 1.</w:t>
+        <w:t xml:space="preserve">The CHD hot-night association is smaller, depends on the uncertainty method, and was not evident in the pre-2020 window. Model-based and HC1 intervals include 1, whereas the Newey–West intervals exclude 1 on the unrounded scale (lag 3: 1.000253 to 1.043860). Pearson residual autocorrelation at lag 1 is 0.508 in that model, so inference for that series depends on how serial dependence is handled. For the hot-night contrast the Newey–West intervals were narrower than the model-based interval, which is atypical under positive residual autocorrelation; the exclusion of 1 therefore rests on the smaller robust variance estimate and is a reason for caution, not confirmation. No interval construction was chosen because it excluded 1.</w:t>
       </w:r>
     </w:p>
     <w:p>
@@ -2612,7 +2612,7 @@
         <w:pStyle w:val="BodyText"/>
       </w:pPr>
       <w:r>
-        <w:t xml:space="preserve">Pollution and influenza are scientifically motivated in this setting [1,18]. Archive models in which they enter are not adjusted versions of the continuity panel. On the 121 months with influenza data, an archive model associated influenza activity with higher CHD counts (1.673, 1.249–2.243), and that coefficient does not adjust Table 2. Confounding by infection, ozone, or nitrogen dioxide is therefore unresolved. Absent cohort person-time, even a stable count ratio remains a count ratio [14].</w:t>
+        <w:t xml:space="preserve">Pollution and influenza are scientifically motivated in this setting [1,18]. Archive models in which they enter are not adjusted versions of the core panel. On the 121 months with influenza data, an archive model associated influenza activity with higher CHD counts (1.673, 1.249–2.243), and that coefficient does not adjust Table 2. Confounding by infection, ozone, or nitrogen dioxide is therefore unresolved. Absent cohort person-time, even a stable count ratio remains a count ratio [14].</w:t>
       </w:r>
     </w:p>
     <w:p>
@@ -2638,7 +2638,7 @@
         <w:pStyle w:val="FirstParagraph"/>
       </w:pPr>
       <w:r>
-        <w:t xml:space="preserve">Between 2013 and 2023, hot nights in Hong Kong increased while cold days persisted. In governed monthly aggregates for people with type 2 diabetes and/or hypertension, the largest positive thermal association was with hot nights for CHD first hospitalisations and with cold days for HF first hospitalisations. Neither association survived correction across the twelve comparisons, and the CHD estimate depended on the treatment of uncertainty. The contribution of this analysis is a set of hypotheses and an explicit account of what monthly aggregate counts cannot settle. Better-denominated and more finely resolved data are required before a thermal effect on cardiac hospitalisation in this cohort can be estimated.</w:t>
+        <w:t xml:space="preserve">Between 2013 and 2023, hot nights in Hong Kong increased while cold days persisted. In governed monthly aggregates for people with type 2 diabetes and/or hypertension, CHD first hospitalisations were more closely associated with hot nights, and HF first hospitalisations with cold days, than with the other thermal encodings examined. Neither association survived correction across the twelve comparisons, and the CHD estimate depended on the treatment of uncertainty. The contribution of this analysis is a set of hypotheses and an explicit account of what monthly aggregate counts cannot settle. Better-denominated and more finely resolved data are required before a thermal effect on cardiac hospitalisation in this cohort can be estimated.</w:t>
       </w:r>
     </w:p>
     <w:bookmarkEnd w:id="48"/>
@@ -2684,7 +2684,7 @@
         <w:t xml:space="preserve"> </w:t>
       </w:r>
       <w:r>
-        <w:t xml:space="preserve">Admission cause was not recorded, so an event is a first hospitalisation after a first diagnosis and not a cardiac-caused admission. Inpatient-only semantics are inferred from the delivered column labels and remain to be confirmed. Monthly counts of cohort members still at risk of a first event were unavailable, so the estimates are count ratios rather than incidence-rate ratios [14]. The design is ecological and monthly, so individual-level and daily-triggering interpretations are not identified [14]. Age, sex, and disease-subtype strata were not delivered. Residual serial correlation remains material for CHD, with lag-1 Pearson autocorrelation of 0.508 in the leading model. Official cold days are concentrated in December–February, so the HF cold-day estimate rests on differences between winters. Official hot-night counts are not hourly nighttime excess heat [17]. Reference rules for monthly hot-tail and cold-tail indicators are not yet fixed, and no such indicator was used as a confirmatory exposure. Pollution, humidity, and influenza confounding is unresolved in the continuity panel. A stroke series was named in correspondence but was not delivered, and no stroke result is reported. External dissemination of the governed aggregates requires confirmation from the outcome and supervising investigators.</w:t>
+        <w:t xml:space="preserve">Admission cause was not recorded, so an event is a first hospitalisation after a first diagnosis and not a cardiac-caused admission. Inpatient-only semantics are inferred from the delivered column labels and remain to be confirmed. Monthly counts of cohort members still at risk of a first event were unavailable, so the estimates are count ratios rather than incidence-rate ratios [14]. The design is ecological and monthly, so individual-level and daily-triggering interpretations are not identified [14]. Age, sex, and disease-subtype strata were not delivered. Residual serial correlation remains material for CHD, with lag-1 Pearson autocorrelation of 0.508 in the leading model. Official cold days are concentrated in December–February, so the HF cold-day estimate rests on differences between winters. Official hot-night counts are not hourly nighttime excess heat [17]. All exposures were measured at a single Observatory station and applied territory-wide; within-territory exposure variation was not modelled. Reference rules for monthly hot-tail and cold-tail indicators are not yet fixed, and no such indicator was used as a confirmatory exposure. Pollution, humidity, and influenza confounding is unresolved in the core panel. A stroke series was named in correspondence but was not delivered, and no stroke result is reported. External dissemination of the governed aggregates requires confirmation from the outcome and supervising investigators.</w:t>
       </w:r>
     </w:p>
     <w:bookmarkEnd w:id="49"/>

</xml_diff>